<commit_message>
Cambios de generación de documento y empresas
</commit_message>
<xml_diff>
--- a/Vinculacion-API/public/templates/Plantilla.docx
+++ b/Vinculacion-API/public/templates/Plantilla.docx
@@ -58,7 +58,7 @@
           <w:szCs w:val="18"/>
         </w:rPr>
         <w:tab/>
-        <w:t xml:space="preserve">              NO. DE OFICIO: </w:t>
+        <w:t xml:space="preserve">              NO. DE OFICIO: DGTYV/</w:t>
       </w:r>
       <w:r>
         <w:rPr>
@@ -67,6 +67,22 @@
           <w:szCs w:val="18"/>
         </w:rPr>
         <w:t>{{NumOficio}}</w:t>
+      </w:r>
+      <w:r>
+        <w:rPr>
+          <w:rFonts w:ascii="Noto Sans" w:hAnsi="Noto Sans" w:cs="Noto Sans"/>
+          <w:sz w:val="18"/>
+          <w:szCs w:val="18"/>
+        </w:rPr>
+        <w:t>/</w:t>
+      </w:r>
+      <w:r>
+        <w:rPr>
+          <w:rFonts w:ascii="Noto Sans" w:hAnsi="Noto Sans" w:cs="Noto Sans"/>
+          <w:sz w:val="18"/>
+          <w:szCs w:val="18"/>
+        </w:rPr>
+        <w:t>{{periodoSemestre}}</w:t>
       </w:r>
     </w:p>
     <w:p>
@@ -151,6 +167,14 @@
         </w:rPr>
         <w:t>{{fecha}}</w:t>
       </w:r>
+      <w:r>
+        <w:rPr>
+          <w:rFonts w:ascii="Noto Sans" w:hAnsi="Noto Sans" w:cs="Noto Sans"/>
+          <w:sz w:val="18"/>
+          <w:szCs w:val="18"/>
+        </w:rPr>
+        <w:t>.</w:t>
+      </w:r>
     </w:p>
     <w:p>
       <w:pPr>
@@ -284,23 +308,23 @@
           <w:sz w:val="18"/>
           <w:szCs w:val="18"/>
         </w:rPr>
-        <w:t>Que el presente sirva para saludarle y con la finalidad de reforzar los conocimientos adquiridos en el aula, solicitarle sea autorizada una visita a las instalaciones de la empresa que usted atinadamente dirige, a un grupo de</w:t>
-      </w:r>
-      <w:r>
-        <w:rPr>
-          <w:rFonts w:ascii="Noto Sans" w:hAnsi="Noto Sans" w:cs="Noto Sans"/>
-          <w:sz w:val="18"/>
-          <w:szCs w:val="18"/>
-        </w:rPr>
-        <w:t xml:space="preserve"> {{numAlumnos}}</w:t>
-      </w:r>
-      <w:r>
-        <w:rPr>
-          <w:rFonts w:ascii="Noto Sans" w:hAnsi="Noto Sans" w:cs="Noto Sans"/>
-          <w:sz w:val="18"/>
-          <w:szCs w:val="18"/>
-        </w:rPr>
-        <w:t xml:space="preserve"> estudiantes de la carrera </w:t>
+        <w:t xml:space="preserve">Que el presente sirva para saludarle y con la finalidad de reforzar los conocimientos adquiridos en el aula, solicitarle sea autorizada una visita a las instalaciones de la empresa que usted atinadamente dirige, a un grupo de </w:t>
+      </w:r>
+      <w:r>
+        <w:rPr>
+          <w:rFonts w:ascii="Noto Sans" w:hAnsi="Noto Sans" w:cs="Noto Sans"/>
+          <w:sz w:val="18"/>
+          <w:szCs w:val="18"/>
+        </w:rPr>
+        <w:t>{{numAlumnos}}</w:t>
+      </w:r>
+      <w:r>
+        <w:rPr>
+          <w:rFonts w:ascii="Noto Sans" w:hAnsi="Noto Sans" w:cs="Noto Sans"/>
+          <w:sz w:val="18"/>
+          <w:szCs w:val="18"/>
+        </w:rPr>
+        <w:t xml:space="preserve"> estudiantes de la carrera de </w:t>
       </w:r>
       <w:r>
         <w:rPr>
@@ -316,15 +340,31 @@
           <w:sz w:val="18"/>
           <w:szCs w:val="18"/>
         </w:rPr>
-        <w:t>, de este Instituto, quienes acudirán bajo la responsabilidad</w:t>
-      </w:r>
-      <w:r>
-        <w:rPr>
-          <w:rFonts w:ascii="Noto Sans" w:hAnsi="Noto Sans" w:cs="Noto Sans"/>
-          <w:sz w:val="18"/>
-          <w:szCs w:val="18"/>
-        </w:rPr>
-        <w:t xml:space="preserve"> de {{maestroEncargado}}</w:t>
+        <w:t>, de este Instituto, quienes acudirán bajo la responsabilidad de</w:t>
+      </w:r>
+      <w:r>
+        <w:rPr>
+          <w:rFonts w:ascii="Noto Sans" w:hAnsi="Noto Sans" w:cs="Noto Sans"/>
+          <w:sz w:val="18"/>
+          <w:szCs w:val="18"/>
+        </w:rPr>
+        <w:t>l maestro(a)</w:t>
+      </w:r>
+      <w:r>
+        <w:rPr>
+          <w:rFonts w:ascii="Noto Sans" w:hAnsi="Noto Sans" w:cs="Noto Sans"/>
+          <w:sz w:val="18"/>
+          <w:szCs w:val="18"/>
+        </w:rPr>
+        <w:t xml:space="preserve"> </w:t>
+      </w:r>
+      <w:r>
+        <w:rPr>
+          <w:rFonts w:ascii="Noto Sans" w:hAnsi="Noto Sans" w:cs="Noto Sans"/>
+          <w:sz w:val="18"/>
+          <w:szCs w:val="18"/>
+        </w:rPr>
+        <w:t>{{maestroEncargado}}</w:t>
       </w:r>
       <w:r>
         <w:rPr>
@@ -438,31 +478,47 @@
           <w:sz w:val="18"/>
           <w:szCs w:val="18"/>
         </w:rPr>
-        <w:t xml:space="preserve"> en el turno </w:t>
-      </w:r>
-      <w:r>
-        <w:rPr>
-          <w:rFonts w:ascii="Noto Sans" w:hAnsi="Noto Sans" w:cs="Noto Sans"/>
-          <w:sz w:val="18"/>
-          <w:szCs w:val="18"/>
-        </w:rPr>
-        <w:t>{{horario}}</w:t>
-      </w:r>
-      <w:r>
-        <w:rPr>
-          <w:rFonts w:ascii="Noto Sans" w:hAnsi="Noto Sans" w:cs="Noto Sans"/>
-          <w:sz w:val="18"/>
-          <w:szCs w:val="18"/>
-        </w:rPr>
-        <w:t>. Para cualquier aclaración puede comunicarse con</w:t>
-      </w:r>
-      <w:r>
-        <w:rPr>
-          <w:rFonts w:ascii="Noto Sans" w:hAnsi="Noto Sans" w:cs="Noto Sans"/>
-          <w:sz w:val="18"/>
-          <w:szCs w:val="18"/>
-        </w:rPr>
-        <w:t xml:space="preserve"> {{contacto}}</w:t>
+        <w:t xml:space="preserve"> en el turno</w:t>
+      </w:r>
+      <w:r>
+        <w:rPr>
+          <w:rFonts w:ascii="Noto Sans" w:hAnsi="Noto Sans" w:cs="Noto Sans"/>
+          <w:sz w:val="18"/>
+          <w:szCs w:val="18"/>
+        </w:rPr>
+        <w:t xml:space="preserve"> {{horario}}</w:t>
+      </w:r>
+      <w:r>
+        <w:rPr>
+          <w:rFonts w:ascii="Noto Sans" w:hAnsi="Noto Sans" w:cs="Noto Sans"/>
+          <w:sz w:val="18"/>
+          <w:szCs w:val="18"/>
+        </w:rPr>
+        <w:t xml:space="preserve"> </w:t>
+      </w:r>
+      <w:r>
+        <w:rPr>
+          <w:rFonts w:ascii="Noto Sans" w:hAnsi="Noto Sans" w:cs="Noto Sans"/>
+          <w:sz w:val="18"/>
+          <w:szCs w:val="18"/>
+        </w:rPr>
+        <w:t>.</w:t>
+      </w:r>
+      <w:r>
+        <w:rPr>
+          <w:rFonts w:ascii="Noto Sans" w:hAnsi="Noto Sans" w:cs="Noto Sans"/>
+          <w:sz w:val="18"/>
+          <w:szCs w:val="18"/>
+        </w:rPr>
+        <w:t xml:space="preserve"> Para cualquier aclaración puede comunicarse con </w:t>
+      </w:r>
+      <w:r>
+        <w:rPr>
+          <w:rFonts w:ascii="Noto Sans" w:hAnsi="Noto Sans" w:cs="Noto Sans"/>
+          <w:sz w:val="18"/>
+          <w:szCs w:val="18"/>
+        </w:rPr>
+        <w:t>{{contacto}}</w:t>
       </w:r>
       <w:r>
         <w:rPr>
@@ -1145,7 +1201,7 @@
               <v:stroke joinstyle="miter"/>
               <v:path gradientshapeok="t" o:connecttype="rect"/>
             </v:shapetype>
-            <v:shape id="Cuadro de texto 2" o:spid="_x0000_s1027" type="#_x0000_t202" style="position:absolute;left:0;text-align:left;margin-left:173.25pt;margin-top:1.35pt;width:195pt;height:46.5pt;z-index:251656192;visibility:visible;mso-wrap-style:square;mso-width-percent:0;mso-height-percent:0;mso-wrap-distance-left:9pt;mso-wrap-distance-top:3.6pt;mso-wrap-distance-right:9pt;mso-wrap-distance-bottom:3.6pt;mso-position-horizontal:absolute;mso-position-horizontal-relative:page;mso-position-vertical:absolute;mso-position-vertical-relative:text;mso-width-percent:0;mso-height-percent:0;mso-width-relative:margin;mso-height-relative:margin;v-text-anchor:top" o:gfxdata="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" filled="f" stroked="f">
+            <v:shape id="Cuadro de texto 2" o:spid="_x0000_s1027" type="#_x0000_t202" style="position:absolute;left:0;text-align:left;margin-left:173.25pt;margin-top:1.35pt;width:195pt;height:46.5pt;z-index:251656192;visibility:visible;mso-wrap-style:square;mso-width-percent:0;mso-height-percent:0;mso-wrap-distance-left:9pt;mso-wrap-distance-top:3.6pt;mso-wrap-distance-right:9pt;mso-wrap-distance-bottom:3.6pt;mso-position-horizontal:absolute;mso-position-horizontal-relative:page;mso-position-vertical:absolute;mso-position-vertical-relative:text;mso-width-percent:0;mso-height-percent:0;mso-width-relative:margin;mso-height-relative:margin;v-text-anchor:top" o:gfxdata="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" filled="f" stroked="f">
               <v:textbox>
                 <w:txbxContent>
                   <w:p>
@@ -1929,7 +1985,7 @@
               <v:stroke joinstyle="miter"/>
               <v:path gradientshapeok="t" o:connecttype="rect"/>
             </v:shapetype>
-            <v:shape id="Text Box 5" o:spid="_x0000_s1026" type="#_x0000_t202" style="position:absolute;margin-left:164.65pt;margin-top:-26.4pt;width:331.45pt;height:38.45pt;z-index:251657216;visibility:visible;mso-wrap-style:square;mso-width-percent:0;mso-height-percent:0;mso-wrap-distance-left:9pt;mso-wrap-distance-top:0;mso-wrap-distance-right:9pt;mso-wrap-distance-bottom:0;mso-position-horizontal:absolute;mso-position-horizontal-relative:margin;mso-position-vertical:absolute;mso-position-vertical-relative:text;mso-width-percent:0;mso-height-percent:0;mso-width-relative:page;mso-height-relative:page;v-text-anchor:top" o:gfxdata="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" filled="f" stroked="f">
+            <v:shape id="Text Box 5" o:spid="_x0000_s1026" type="#_x0000_t202" style="position:absolute;margin-left:164.65pt;margin-top:-26.4pt;width:331.45pt;height:38.45pt;z-index:251657216;visibility:visible;mso-wrap-style:square;mso-width-percent:0;mso-height-percent:0;mso-wrap-distance-left:9pt;mso-wrap-distance-top:0;mso-wrap-distance-right:9pt;mso-wrap-distance-bottom:0;mso-position-horizontal:absolute;mso-position-horizontal-relative:margin;mso-position-vertical:absolute;mso-position-vertical-relative:text;mso-width-percent:0;mso-height-percent:0;mso-width-relative:page;mso-height-relative:page;v-text-anchor:top" o:gfxdata="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" filled="f" stroked="f">
               <v:textbox inset="0,0,0,0">
                 <w:txbxContent>
                   <w:p>
@@ -2478,16 +2534,16 @@
       </w:pPr>
     </w:lvl>
   </w:abstractNum>
-  <w:num w:numId="1" w16cid:durableId="1441299320">
+  <w:num w:numId="1" w16cid:durableId="1681086083">
     <w:abstractNumId w:val="2"/>
   </w:num>
-  <w:num w:numId="2" w16cid:durableId="566494081">
+  <w:num w:numId="2" w16cid:durableId="555358071">
     <w:abstractNumId w:val="0"/>
   </w:num>
-  <w:num w:numId="3" w16cid:durableId="1849831056">
+  <w:num w:numId="3" w16cid:durableId="876812838">
     <w:abstractNumId w:val="3"/>
   </w:num>
-  <w:num w:numId="4" w16cid:durableId="255015133">
+  <w:num w:numId="4" w16cid:durableId="1284581269">
     <w:abstractNumId w:val="1"/>
   </w:num>
 </w:numbering>

</xml_diff>